<commit_message>
auto: push changes 2026-09-04_10-27-31,82
</commit_message>
<xml_diff>
--- a/Generateur Des Factures/Factures/Facture numéro 16-2026.docx
+++ b/Generateur Des Factures/Factures/Facture numéro 16-2026.docx
@@ -990,7 +990,7 @@
                 <w:szCs w:val="24"/>
                 <w:lang w:val="en-US" w:eastAsia="fr-MA"/>
               </w:rPr>
-              <w:t>2</w:t>
+              <w:t>4</w:t>
             </w:r>
           </w:p>
           <w:p>
@@ -1095,7 +1095,7 @@
                 <w:szCs w:val="24"/>
                 <w:lang w:val="en-US" w:eastAsia="fr-MA"/>
               </w:rPr>
-              <w:t>100</w:t>
+              <w:t>50</w:t>
             </w:r>
           </w:p>
           <w:p>

</xml_diff>

<commit_message>
auto: push changes 2026-09-04_10-32-11,39
</commit_message>
<xml_diff>
--- a/Generateur Des Factures/Factures/Facture numéro 16-2026.docx
+++ b/Generateur Des Factures/Factures/Facture numéro 16-2026.docx
@@ -286,6 +286,7 @@
                 <w:szCs w:val="28"/>
               </w:rPr>
             </w:pPr>
+            <w:proofErr w:type="spellStart"/>
             <w:r>
               <w:rPr>
                 <w:rFonts w:ascii="Aptos" w:eastAsia="+mn-ea" w:hAnsi="Aptos" w:cs="+mn-cs"/>
@@ -296,7 +297,20 @@
                 <w:sz w:val="28"/>
                 <w:szCs w:val="28"/>
               </w:rPr>
-              <w:t>Evix management</w:t>
+              <w:t>Evix</w:t>
+            </w:r>
+            <w:proofErr w:type="spellEnd"/>
+            <w:r>
+              <w:rPr>
+                <w:rFonts w:ascii="Aptos" w:eastAsia="+mn-ea" w:hAnsi="Aptos" w:cs="+mn-cs"/>
+                <w:b/>
+                <w:bCs/>
+                <w:color w:val="000000"/>
+                <w:kern w:val="24"/>
+                <w:sz w:val="28"/>
+                <w:szCs w:val="28"/>
+              </w:rPr>
+              <w:t xml:space="preserve"> management</w:t>
             </w:r>
           </w:p>
           <w:p>
@@ -380,7 +394,55 @@
                 <w:szCs w:val="24"/>
                 <w:lang w:val="fr-FR"/>
               </w:rPr>
-              <w:t>Rue tafetacht spaces la rocade Rabat</w:t>
+              <w:t xml:space="preserve">Rue </w:t>
+            </w:r>
+            <w:proofErr w:type="spellStart"/>
+            <w:r>
+              <w:rPr>
+                <w:rFonts w:ascii="Aptos" w:eastAsia="+mn-ea" w:hAnsi="Aptos" w:cs="+mn-cs"/>
+                <w:color w:val="000000"/>
+                <w:kern w:val="24"/>
+                <w:sz w:val="24"/>
+                <w:szCs w:val="24"/>
+                <w:lang w:val="fr-FR"/>
+              </w:rPr>
+              <w:t>tafetacht</w:t>
+            </w:r>
+            <w:proofErr w:type="spellEnd"/>
+            <w:r>
+              <w:rPr>
+                <w:rFonts w:ascii="Aptos" w:eastAsia="+mn-ea" w:hAnsi="Aptos" w:cs="+mn-cs"/>
+                <w:color w:val="000000"/>
+                <w:kern w:val="24"/>
+                <w:sz w:val="24"/>
+                <w:szCs w:val="24"/>
+                <w:lang w:val="fr-FR"/>
+              </w:rPr>
+              <w:t xml:space="preserve"> </w:t>
+            </w:r>
+            <w:proofErr w:type="spellStart"/>
+            <w:r>
+              <w:rPr>
+                <w:rFonts w:ascii="Aptos" w:eastAsia="+mn-ea" w:hAnsi="Aptos" w:cs="+mn-cs"/>
+                <w:color w:val="000000"/>
+                <w:kern w:val="24"/>
+                <w:sz w:val="24"/>
+                <w:szCs w:val="24"/>
+                <w:lang w:val="fr-FR"/>
+              </w:rPr>
+              <w:t>spaces</w:t>
+            </w:r>
+            <w:proofErr w:type="spellEnd"/>
+            <w:r>
+              <w:rPr>
+                <w:rFonts w:ascii="Aptos" w:eastAsia="+mn-ea" w:hAnsi="Aptos" w:cs="+mn-cs"/>
+                <w:color w:val="000000"/>
+                <w:kern w:val="24"/>
+                <w:sz w:val="24"/>
+                <w:szCs w:val="24"/>
+                <w:lang w:val="fr-FR"/>
+              </w:rPr>
+              <w:t xml:space="preserve"> la rocade Rabat</w:t>
             </w:r>
           </w:p>
         </w:tc>
@@ -976,6 +1038,19 @@
                 <w:rFonts w:ascii="Aptos" w:eastAsia="Times New Roman" w:hAnsi="Aptos" w:cs="Arial"/>
                 <w:color w:val="000000"/>
                 <w:kern w:val="24"/>
+                <w:sz w:val="18"/>
+                <w:szCs w:val="18"/>
+                <w:lang w:val="en-US" w:eastAsia="fr-MA"/>
+              </w:rPr>
+            </w:pPr>
+          </w:p>
+          <w:p>
+            <w:pPr>
+              <w:spacing w:after="0" w:line="240" w:lineRule="auto"/>
+              <w:rPr>
+                <w:rFonts w:ascii="Aptos" w:eastAsia="Times New Roman" w:hAnsi="Aptos" w:cs="Arial"/>
+                <w:color w:val="000000"/>
+                <w:kern w:val="24"/>
                 <w:sz w:val="24"/>
                 <w:szCs w:val="24"/>
                 <w:lang w:val="en-US" w:eastAsia="fr-MA"/>
@@ -1081,6 +1156,19 @@
                 <w:rFonts w:ascii="Aptos" w:eastAsia="Times New Roman" w:hAnsi="Aptos" w:cs="Arial"/>
                 <w:color w:val="000000"/>
                 <w:kern w:val="24"/>
+                <w:sz w:val="18"/>
+                <w:szCs w:val="18"/>
+                <w:lang w:val="en-US" w:eastAsia="fr-MA"/>
+              </w:rPr>
+            </w:pPr>
+          </w:p>
+          <w:p>
+            <w:pPr>
+              <w:spacing w:after="0" w:line="240" w:lineRule="auto"/>
+              <w:rPr>
+                <w:rFonts w:ascii="Aptos" w:eastAsia="Times New Roman" w:hAnsi="Aptos" w:cs="Arial"/>
+                <w:color w:val="000000"/>
+                <w:kern w:val="24"/>
                 <w:sz w:val="24"/>
                 <w:szCs w:val="24"/>
                 <w:lang w:val="en-US" w:eastAsia="fr-MA"/>
@@ -1178,6 +1266,19 @@
               </w:rPr>
               <w:t>5000</w:t>
             </w:r>
+          </w:p>
+          <w:p>
+            <w:pPr>
+              <w:spacing w:after="0" w:line="240" w:lineRule="auto"/>
+              <w:rPr>
+                <w:rFonts w:ascii="Aptos" w:eastAsia="Times New Roman" w:hAnsi="Aptos" w:cs="Arial"/>
+                <w:color w:val="000000"/>
+                <w:kern w:val="24"/>
+                <w:sz w:val="18"/>
+                <w:szCs w:val="18"/>
+                <w:lang w:val="en-US" w:eastAsia="fr-MA"/>
+              </w:rPr>
+            </w:pPr>
           </w:p>
           <w:p>
             <w:pPr>
@@ -1632,6 +1733,7 @@
               <w:lang w:eastAsia="x-none"/>
             </w:rPr>
           </w:pPr>
+          <w:proofErr w:type="gramStart"/>
           <w:r>
             <w:rPr>
               <w:rFonts w:ascii="Calibri" w:eastAsia="Calibri" w:hAnsi="Calibri" w:cs="Times New Roman"/>
@@ -1642,7 +1744,20 @@
               <w:vertAlign w:val="superscript"/>
               <w:lang w:eastAsia="x-none"/>
             </w:rPr>
-            <w:t xml:space="preserve">Auto Entrepreneur :    </w:t>
+            <w:t>Auto Entrepreneur</w:t>
+          </w:r>
+          <w:proofErr w:type="gramEnd"/>
+          <w:r>
+            <w:rPr>
+              <w:rFonts w:ascii="Calibri" w:eastAsia="Calibri" w:hAnsi="Calibri" w:cs="Times New Roman"/>
+              <w:b/>
+              <w:bCs/>
+              <w:sz w:val="26"/>
+              <w:szCs w:val="26"/>
+              <w:vertAlign w:val="superscript"/>
+              <w:lang w:eastAsia="x-none"/>
+            </w:rPr>
+            <w:t xml:space="preserve"> :    </w:t>
           </w:r>
           <w:r>
             <w:rPr>
@@ -1822,7 +1937,33 @@
               <w:vertAlign w:val="superscript"/>
               <w:lang w:eastAsia="x-none"/>
             </w:rPr>
-            <w:t xml:space="preserve">ICE          :                        </w:t>
+            <w:t xml:space="preserve">ICE       </w:t>
+          </w:r>
+          <w:proofErr w:type="gramStart"/>
+          <w:r>
+            <w:rPr>
+              <w:rFonts w:ascii="Calibri" w:eastAsia="Calibri" w:hAnsi="Calibri" w:cs="Times New Roman"/>
+              <w:b/>
+              <w:bCs/>
+              <w:sz w:val="26"/>
+              <w:szCs w:val="26"/>
+              <w:vertAlign w:val="superscript"/>
+              <w:lang w:eastAsia="x-none"/>
+            </w:rPr>
+            <w:t xml:space="preserve">   :</w:t>
+          </w:r>
+          <w:proofErr w:type="gramEnd"/>
+          <w:r>
+            <w:rPr>
+              <w:rFonts w:ascii="Calibri" w:eastAsia="Calibri" w:hAnsi="Calibri" w:cs="Times New Roman"/>
+              <w:b/>
+              <w:bCs/>
+              <w:sz w:val="26"/>
+              <w:szCs w:val="26"/>
+              <w:vertAlign w:val="superscript"/>
+              <w:lang w:eastAsia="x-none"/>
+            </w:rPr>
+            <w:t xml:space="preserve">                        </w:t>
           </w:r>
           <w:r>
             <w:rPr>
@@ -1918,7 +2059,33 @@
               <w:vertAlign w:val="superscript"/>
               <w:lang w:eastAsia="x-none"/>
             </w:rPr>
-            <w:t xml:space="preserve">IF            :                        </w:t>
+            <w:t xml:space="preserve">IF         </w:t>
+          </w:r>
+          <w:proofErr w:type="gramStart"/>
+          <w:r>
+            <w:rPr>
+              <w:rFonts w:ascii="Calibri" w:eastAsia="Calibri" w:hAnsi="Calibri" w:cs="Times New Roman"/>
+              <w:b/>
+              <w:bCs/>
+              <w:sz w:val="26"/>
+              <w:szCs w:val="26"/>
+              <w:vertAlign w:val="superscript"/>
+              <w:lang w:eastAsia="x-none"/>
+            </w:rPr>
+            <w:t xml:space="preserve">   :</w:t>
+          </w:r>
+          <w:proofErr w:type="gramEnd"/>
+          <w:r>
+            <w:rPr>
+              <w:rFonts w:ascii="Calibri" w:eastAsia="Calibri" w:hAnsi="Calibri" w:cs="Times New Roman"/>
+              <w:b/>
+              <w:bCs/>
+              <w:sz w:val="26"/>
+              <w:szCs w:val="26"/>
+              <w:vertAlign w:val="superscript"/>
+              <w:lang w:eastAsia="x-none"/>
+            </w:rPr>
+            <w:t xml:space="preserve">                        </w:t>
           </w:r>
           <w:r>
             <w:rPr>
@@ -1961,7 +2128,33 @@
               <w:vertAlign w:val="superscript"/>
               <w:lang w:eastAsia="x-none"/>
             </w:rPr>
-            <w:t xml:space="preserve">TEL   :                         </w:t>
+            <w:t>TEL</w:t>
+          </w:r>
+          <w:proofErr w:type="gramStart"/>
+          <w:r>
+            <w:rPr>
+              <w:rFonts w:ascii="Calibri" w:eastAsia="Calibri" w:hAnsi="Calibri" w:cs="Times New Roman"/>
+              <w:b/>
+              <w:bCs/>
+              <w:sz w:val="26"/>
+              <w:szCs w:val="26"/>
+              <w:vertAlign w:val="superscript"/>
+              <w:lang w:eastAsia="x-none"/>
+            </w:rPr>
+            <w:t xml:space="preserve">   :</w:t>
+          </w:r>
+          <w:proofErr w:type="gramEnd"/>
+          <w:r>
+            <w:rPr>
+              <w:rFonts w:ascii="Calibri" w:eastAsia="Calibri" w:hAnsi="Calibri" w:cs="Times New Roman"/>
+              <w:b/>
+              <w:bCs/>
+              <w:sz w:val="26"/>
+              <w:szCs w:val="26"/>
+              <w:vertAlign w:val="superscript"/>
+              <w:lang w:eastAsia="x-none"/>
+            </w:rPr>
+            <w:t xml:space="preserve">                         </w:t>
           </w:r>
           <w:r>
             <w:rPr>

</xml_diff>